<commit_message>
Merge origin/main, remove hyphens
</commit_message>
<xml_diff>
--- a/profiles/Pair_01_questionnaire.docx
+++ b/profiles/Pair_01_questionnaire.docx
@@ -8,7 +8,7 @@
         <w:spacing w:after="200"/>
       </w:pPr>
       <w:r>
-        <w:t xml:space="preserve">Profile Pair Compatibility Questionnaire — Pair 1</w:t>
+        <w:t xml:space="preserve">Profile Pair Compatibility Questionnaire: Pair 1</w:t>
       </w:r>
     </w:p>
     <w:p>
@@ -36,7 +36,7 @@
         <w:spacing w:after="160"/>
       </w:pPr>
       <w:r>
-        <w:t xml:space="preserve">I'm 31, a civil engineer for the county — bridges and culverts, mostly. My degree is from the state university. Five foot eleven, average build, white. Agnostic, though I put no real effort into it. I grew up two hours from here, in the town where my parents still live.</w:t>
+        <w:t xml:space="preserve">I'm 31, a civil engineer for the county, bridges and culverts, mostly. My degree is from the state university. Five foot eleven, average build, white. Agnostic, though I put no real effort into it. I grew up two hours from here, in the town where my parents still live.</w:t>
       </w:r>
     </w:p>
     <w:p>
@@ -52,7 +52,7 @@
         <w:spacing w:after="160"/>
       </w:pPr>
       <w:r>
-        <w:t xml:space="preserve">There's an old frame I've been rebuilding in the garage since spring. Otherwise it's forty or fifty miles whenever the weather and the calendar cooperate. I cook a proper meal most evenings — the best part of my day — usually with records on rather than a playlist.</w:t>
+        <w:t xml:space="preserve">There's an old frame I've been rebuilding in the garage since spring. Otherwise it's forty or fifty miles whenever the weather and the calendar cooperate. I cook a proper meal most evenings, the best part of my day, usually with records on rather than a playlist.</w:t>
       </w:r>
     </w:p>
     <w:p>
@@ -80,7 +80,7 @@
         <w:spacing w:after="160"/>
       </w:pPr>
       <w:r>
-        <w:t xml:space="preserve">I'm 29 and I work as a physical therapist at an outpatient clinic — college degree, then the clinical qualification. Five foot six with an average build, white. Religion rarely crosses my mind; agnostic would be the accurate word. My mother and two brothers are an hour north, where I grew up.</w:t>
+        <w:t xml:space="preserve">I'm 29 and I work as a physical therapist at an outpatient clinic, college degree, then the clinical qualification. Five foot six with an average build, white. Religion rarely crosses my mind; agnostic would be the accurate word. My mother and two brothers are an hour north, where I grew up.</w:t>
       </w:r>
     </w:p>
     <w:p>

</xml_diff>